<commit_message>
docs: show actual training samples in four guides v1.13.98
</commit_message>
<xml_diff>
--- a/reports/training_materials_20260916/01_CPT语料与运行说明.docx
+++ b/reports/training_materials_20260916/01_CPT语料与运行说明.docx
@@ -358,268 +358,27 @@
     <w:p>
       <w:pPr/>
       <w:r>
-        <w:t>训练输入是连续知识文本，不是问答对。清洗后按完整文本块组织记录，去除无关版面内容并去重；表格保留结构，公式保留表达。正文不套聊天模板，不跨书混拼。</w:t>
+        <w:t>下面摘录实际 train.jsonl 的第 1 条记录。展示 text 字段全文，未改写正文；省略 id、指纹、token 数及来源索引等管理字段。</w:t>
       </w:r>
     </w:p>
-    <w:tbl>
-      <w:tblPr>
-        <w:tblW w:type="auto" w:w="0"/>
-        <w:tblLayout w:type="fixed"/>
-        <w:tblLook w:firstColumn="1" w:firstRow="1" w:lastColumn="0" w:lastRow="0" w:noHBand="0" w:noVBand="1" w:val="04A0"/>
-      </w:tblPr>
-      <w:tblGrid>
-        <w:gridCol w:w="5102"/>
-        <w:gridCol w:w="2268"/>
-        <w:gridCol w:w="2268"/>
-      </w:tblGrid>
-      <w:tr>
-        <w:trPr>
-          <w:cantSplit/>
-          <w:tblHeader/>
-        </w:trPr>
-        <w:tc>
-          <w:tcPr>
-            <w:tcW w:type="dxa" w:w="5102"/>
-            <w:vAlign w:val="center"/>
-            <w:shd w:fill="E7E7E7"/>
-          </w:tcPr>
-          <w:p>
-            <w:pPr>
-              <w:keepNext/>
-              <w:spacing w:after="20" w:before="20"/>
-              <w:ind w:firstLine="0" w:firstLineChars="0"/>
-            </w:pPr>
-            <w:r>
-              <w:rPr>
-                <w:b/>
-              </w:rPr>
-              <w:t>语料版本</w:t>
-            </w:r>
-          </w:p>
-        </w:tc>
-        <w:tc>
-          <w:tcPr>
-            <w:tcW w:type="dxa" w:w="2268"/>
-            <w:vAlign w:val="center"/>
-            <w:shd w:fill="E7E7E7"/>
-          </w:tcPr>
-          <w:p>
-            <w:pPr>
-              <w:keepNext/>
-              <w:spacing w:after="20" w:before="20"/>
-              <w:ind w:firstLine="0" w:firstLineChars="0"/>
-            </w:pPr>
-            <w:r>
-              <w:rPr>
-                <w:b/>
-              </w:rPr>
-              <w:t>记录数</w:t>
-            </w:r>
-          </w:p>
-        </w:tc>
-        <w:tc>
-          <w:tcPr>
-            <w:tcW w:type="dxa" w:w="2268"/>
-            <w:vAlign w:val="center"/>
-            <w:shd w:fill="E7E7E7"/>
-          </w:tcPr>
-          <w:p>
-            <w:pPr>
-              <w:keepNext/>
-              <w:spacing w:after="20" w:before="20"/>
-              <w:ind w:firstLine="0" w:firstLineChars="0"/>
-            </w:pPr>
-            <w:r>
-              <w:rPr>
-                <w:b/>
-              </w:rPr>
-              <w:t>正文 token</w:t>
-            </w:r>
-          </w:p>
-        </w:tc>
-      </w:tr>
-      <w:tr>
-        <w:trPr>
-          <w:cantSplit/>
-        </w:trPr>
-        <w:tc>
-          <w:tcPr>
-            <w:tcW w:type="dxa" w:w="5102"/>
-            <w:vAlign w:val="center"/>
-          </w:tcPr>
-          <w:p>
-            <w:pPr>
-              <w:spacing w:after="20" w:before="20"/>
-              <w:ind w:firstLine="0" w:firstLineChars="0"/>
-            </w:pPr>
-            <w:r>
-              <w:rPr>
-                <w:b w:val="0"/>
-              </w:rPr>
-              <w:t>全部 13 份教材</w:t>
-            </w:r>
-          </w:p>
-        </w:tc>
-        <w:tc>
-          <w:tcPr>
-            <w:tcW w:type="dxa" w:w="2268"/>
-            <w:vAlign w:val="center"/>
-          </w:tcPr>
-          <w:p>
-            <w:pPr>
-              <w:spacing w:after="20" w:before="20"/>
-              <w:ind w:firstLine="0" w:firstLineChars="0"/>
-            </w:pPr>
-            <w:r>
-              <w:rPr>
-                <w:b w:val="0"/>
-              </w:rPr>
-              <w:t>4,707</w:t>
-            </w:r>
-          </w:p>
-        </w:tc>
-        <w:tc>
-          <w:tcPr>
-            <w:tcW w:type="dxa" w:w="2268"/>
-            <w:vAlign w:val="center"/>
-          </w:tcPr>
-          <w:p>
-            <w:pPr>
-              <w:spacing w:after="20" w:before="20"/>
-              <w:ind w:firstLine="0" w:firstLineChars="0"/>
-            </w:pPr>
-            <w:r>
-              <w:rPr>
-                <w:b w:val="0"/>
-              </w:rPr>
-              <w:t>1,844,881</w:t>
-            </w:r>
-          </w:p>
-        </w:tc>
-      </w:tr>
-      <w:tr>
-        <w:trPr>
-          <w:cantSplit/>
-        </w:trPr>
-        <w:tc>
-          <w:tcPr>
-            <w:tcW w:type="dxa" w:w="5102"/>
-            <w:vAlign w:val="center"/>
-          </w:tcPr>
-          <w:p>
-            <w:pPr>
-              <w:spacing w:after="20" w:before="20"/>
-              <w:ind w:firstLine="0" w:firstLineChars="0"/>
-            </w:pPr>
-            <w:r>
-              <w:rPr>
-                <w:b w:val="0"/>
-              </w:rPr>
-              <w:t>新增知识单元</w:t>
-            </w:r>
-          </w:p>
-        </w:tc>
-        <w:tc>
-          <w:tcPr>
-            <w:tcW w:type="dxa" w:w="2268"/>
-            <w:vAlign w:val="center"/>
-          </w:tcPr>
-          <w:p>
-            <w:pPr>
-              <w:spacing w:after="20" w:before="20"/>
-              <w:ind w:firstLine="0" w:firstLineChars="0"/>
-            </w:pPr>
-            <w:r>
-              <w:rPr>
-                <w:b w:val="0"/>
-              </w:rPr>
-              <w:t>205</w:t>
-            </w:r>
-          </w:p>
-        </w:tc>
-        <w:tc>
-          <w:tcPr>
-            <w:tcW w:type="dxa" w:w="2268"/>
-            <w:vAlign w:val="center"/>
-          </w:tcPr>
-          <w:p>
-            <w:pPr>
-              <w:spacing w:after="20" w:before="20"/>
-              <w:ind w:firstLine="0" w:firstLineChars="0"/>
-            </w:pPr>
-            <w:r>
-              <w:rPr>
-                <w:b w:val="0"/>
-              </w:rPr>
-              <w:t>23,131</w:t>
-            </w:r>
-          </w:p>
-        </w:tc>
-      </w:tr>
-      <w:tr>
-        <w:trPr>
-          <w:cantSplit/>
-        </w:trPr>
-        <w:tc>
-          <w:tcPr>
-            <w:tcW w:type="dxa" w:w="5102"/>
-            <w:vAlign w:val="center"/>
-          </w:tcPr>
-          <w:p>
-            <w:pPr>
-              <w:spacing w:after="20" w:before="20"/>
-              <w:ind w:firstLine="0" w:firstLineChars="0"/>
-            </w:pPr>
-            <w:r>
-              <w:rPr>
-                <w:b w:val="0"/>
-              </w:rPr>
-              <w:t>合并训练集</w:t>
-            </w:r>
-          </w:p>
-        </w:tc>
-        <w:tc>
-          <w:tcPr>
-            <w:tcW w:type="dxa" w:w="2268"/>
-            <w:vAlign w:val="center"/>
-          </w:tcPr>
-          <w:p>
-            <w:pPr>
-              <w:spacing w:after="20" w:before="20"/>
-              <w:ind w:firstLine="0" w:firstLineChars="0"/>
-            </w:pPr>
-            <w:r>
-              <w:rPr>
-                <w:b w:val="0"/>
-              </w:rPr>
-              <w:t>4,912</w:t>
-            </w:r>
-          </w:p>
-        </w:tc>
-        <w:tc>
-          <w:tcPr>
-            <w:tcW w:type="dxa" w:w="2268"/>
-            <w:vAlign w:val="center"/>
-          </w:tcPr>
-          <w:p>
-            <w:pPr>
-              <w:spacing w:after="20" w:before="20"/>
-              <w:ind w:firstLine="0" w:firstLineChars="0"/>
-            </w:pPr>
-            <w:r>
-              <w:rPr>
-                <w:b w:val="0"/>
-              </w:rPr>
-              <w:t>1,868,012</w:t>
-            </w:r>
-          </w:p>
-        </w:tc>
-      </w:tr>
-    </w:tbl>
     <w:p>
-      <w:pPr/>
+      <w:pPr>
+        <w:pStyle w:val="CodeText"/>
+        <w:keepNext/>
+        <w:shd w:fill="F2F2F2"/>
+      </w:pPr>
       <w:r>
-        <w:t>交付为同内容 JSONL 和 Parquet。训练器读取 text 字段；来源、章节及页码通过配套索引追踪。以下为字段示意，正文为演示文本。</w:t>
+        <w:t>{</w:t>
+      </w:r>
+    </w:p>
+    <w:p>
+      <w:pPr>
+        <w:pStyle w:val="CodeText"/>
+        <w:keepNext/>
+        <w:shd w:fill="F2F2F2"/>
+      </w:pPr>
+      <w:r>
+        <w:t xml:space="preserve">  "text": "Source: 43 Book Manuscript 398 1 10 20230209\nSection: I General introduction &gt; 1 Ports and waterways systems &gt; 1.1 On the importance of waterborne transport and its facilities\n\nPorts and waterways are parts of a coherent system enabling supply chains over water. Their functions, design, operation and maintenance influence the performance of these supply chains and the transport system as a whole. This chapter gives a general orientation, terminology and essential definitions, as well as an introduction into how the elements of the transport system interact."</w:t>
       </w:r>
     </w:p>
     <w:p>
@@ -629,280 +388,31 @@
         <w:shd w:fill="F2F2F2"/>
       </w:pPr>
       <w:r>
-        <w:t>{"text":"仓储知识示例：库存盘点需要核对账面数量与实物数量。"}</w:t>
+        <w:t>}</w:t>
       </w:r>
     </w:p>
-    <w:tbl>
-      <w:tblPr>
-        <w:tblW w:type="auto" w:w="0"/>
-        <w:tblLayout w:type="fixed"/>
-        <w:tblLook w:firstColumn="1" w:firstRow="1" w:lastColumn="0" w:lastRow="0" w:noHBand="0" w:noVBand="1" w:val="04A0"/>
-      </w:tblPr>
-      <w:tblGrid>
-        <w:gridCol w:w="3402"/>
-        <w:gridCol w:w="6236"/>
-      </w:tblGrid>
-      <w:tr>
-        <w:trPr>
-          <w:cantSplit/>
-          <w:tblHeader/>
-        </w:trPr>
-        <w:tc>
-          <w:tcPr>
-            <w:tcW w:type="dxa" w:w="3402"/>
-            <w:vAlign w:val="center"/>
-            <w:shd w:fill="E7E7E7"/>
-          </w:tcPr>
-          <w:p>
-            <w:pPr>
-              <w:keepNext/>
-              <w:spacing w:after="20" w:before="20"/>
-              <w:ind w:firstLine="0" w:firstLineChars="0"/>
-            </w:pPr>
-            <w:r>
-              <w:rPr>
-                <w:b/>
-              </w:rPr>
-              <w:t>读取规则</w:t>
-            </w:r>
-          </w:p>
-        </w:tc>
-        <w:tc>
-          <w:tcPr>
-            <w:tcW w:type="dxa" w:w="6236"/>
-            <w:vAlign w:val="center"/>
-            <w:shd w:fill="E7E7E7"/>
-          </w:tcPr>
-          <w:p>
-            <w:pPr>
-              <w:keepNext/>
-              <w:spacing w:after="20" w:before="20"/>
-              <w:ind w:firstLine="0" w:firstLineChars="0"/>
-            </w:pPr>
-            <w:r>
-              <w:rPr>
-                <w:b/>
-              </w:rPr>
-              <w:t>设置</w:t>
-            </w:r>
-          </w:p>
-        </w:tc>
-      </w:tr>
-      <w:tr>
-        <w:trPr>
-          <w:cantSplit/>
-        </w:trPr>
-        <w:tc>
-          <w:tcPr>
-            <w:tcW w:type="dxa" w:w="3402"/>
-            <w:vAlign w:val="center"/>
-          </w:tcPr>
-          <w:p>
-            <w:pPr>
-              <w:spacing w:after="20" w:before="20"/>
-              <w:ind w:firstLine="0" w:firstLineChars="0"/>
-            </w:pPr>
-            <w:r>
-              <w:rPr>
-                <w:b w:val="0"/>
-              </w:rPr>
-              <w:t>数据入口</w:t>
-            </w:r>
-          </w:p>
-        </w:tc>
-        <w:tc>
-          <w:tcPr>
-            <w:tcW w:type="dxa" w:w="6236"/>
-            <w:vAlign w:val="center"/>
-          </w:tcPr>
-          <w:p>
-            <w:pPr>
-              <w:spacing w:after="20" w:before="20"/>
-              <w:ind w:firstLine="0" w:firstLineChars="0"/>
-            </w:pPr>
-            <w:r>
-              <w:rPr>
-                <w:b w:val="0"/>
-              </w:rPr>
-              <w:t>train.parquet；text_key=text</w:t>
-            </w:r>
-          </w:p>
-        </w:tc>
-      </w:tr>
-      <w:tr>
-        <w:trPr>
-          <w:cantSplit/>
-        </w:trPr>
-        <w:tc>
-          <w:tcPr>
-            <w:tcW w:type="dxa" w:w="3402"/>
-            <w:vAlign w:val="center"/>
-          </w:tcPr>
-          <w:p>
-            <w:pPr>
-              <w:spacing w:after="20" w:before="20"/>
-              <w:ind w:firstLine="0" w:firstLineChars="0"/>
-            </w:pPr>
-            <w:r>
-              <w:rPr>
-                <w:b w:val="0"/>
-              </w:rPr>
-              <w:t>结束标记</w:t>
-            </w:r>
-          </w:p>
-        </w:tc>
-        <w:tc>
-          <w:tcPr>
-            <w:tcW w:type="dxa" w:w="6236"/>
-            <w:vAlign w:val="center"/>
-          </w:tcPr>
-          <w:p>
-            <w:pPr>
-              <w:spacing w:after="20" w:before="20"/>
-              <w:ind w:firstLine="0" w:firstLineChars="0"/>
-            </w:pPr>
-            <w:r>
-              <w:rPr>
-                <w:b w:val="0"/>
-              </w:rPr>
-              <w:t>加载器追加一次 EOS，不在正文手工添加</w:t>
-            </w:r>
-          </w:p>
-        </w:tc>
-      </w:tr>
-      <w:tr>
-        <w:trPr>
-          <w:cantSplit/>
-        </w:trPr>
-        <w:tc>
-          <w:tcPr>
-            <w:tcW w:type="dxa" w:w="3402"/>
-            <w:vAlign w:val="center"/>
-          </w:tcPr>
-          <w:p>
-            <w:pPr>
-              <w:spacing w:after="20" w:before="20"/>
-              <w:ind w:firstLine="0" w:firstLineChars="0"/>
-            </w:pPr>
-            <w:r>
-              <w:rPr>
-                <w:b w:val="0"/>
-              </w:rPr>
-              <w:t>最大长度</w:t>
-            </w:r>
-          </w:p>
-        </w:tc>
-        <w:tc>
-          <w:tcPr>
-            <w:tcW w:type="dxa" w:w="6236"/>
-            <w:vAlign w:val="center"/>
-          </w:tcPr>
-          <w:p>
-            <w:pPr>
-              <w:spacing w:after="20" w:before="20"/>
-              <w:ind w:firstLine="0" w:firstLineChars="0"/>
-            </w:pPr>
-            <w:r>
-              <w:rPr>
-                <w:b w:val="0"/>
-              </w:rPr>
-              <w:t>4,096 token；本批最大 4,085</w:t>
-            </w:r>
-          </w:p>
-        </w:tc>
-      </w:tr>
-      <w:tr>
-        <w:trPr>
-          <w:cantSplit/>
-        </w:trPr>
-        <w:tc>
-          <w:tcPr>
-            <w:tcW w:type="dxa" w:w="3402"/>
-            <w:vAlign w:val="center"/>
-          </w:tcPr>
-          <w:p>
-            <w:pPr>
-              <w:spacing w:after="20" w:before="20"/>
-              <w:ind w:firstLine="0" w:firstLineChars="0"/>
-            </w:pPr>
-            <w:r>
-              <w:rPr>
-                <w:b w:val="0"/>
-              </w:rPr>
-              <w:t>超长处理</w:t>
-            </w:r>
-          </w:p>
-        </w:tc>
-        <w:tc>
-          <w:tcPr>
-            <w:tcW w:type="dxa" w:w="6236"/>
-            <w:vAlign w:val="center"/>
-          </w:tcPr>
-          <w:p>
-            <w:pPr>
-              <w:spacing w:after="20" w:before="20"/>
-              <w:ind w:firstLine="0" w:firstLineChars="0"/>
-            </w:pPr>
-            <w:r>
-              <w:rPr>
-                <w:b w:val="0"/>
-              </w:rPr>
-              <w:t>报错，不静默截断</w:t>
-            </w:r>
-          </w:p>
-        </w:tc>
-      </w:tr>
-      <w:tr>
-        <w:trPr>
-          <w:cantSplit/>
-        </w:trPr>
-        <w:tc>
-          <w:tcPr>
-            <w:tcW w:type="dxa" w:w="3402"/>
-            <w:vAlign w:val="center"/>
-          </w:tcPr>
-          <w:p>
-            <w:pPr>
-              <w:spacing w:after="20" w:before="20"/>
-              <w:ind w:firstLine="0" w:firstLineChars="0"/>
-            </w:pPr>
-            <w:r>
-              <w:rPr>
-                <w:b w:val="0"/>
-              </w:rPr>
-              <w:t>训练方式</w:t>
-            </w:r>
-          </w:p>
-        </w:tc>
-        <w:tc>
-          <w:tcPr>
-            <w:tcW w:type="dxa" w:w="6236"/>
-            <w:vAlign w:val="center"/>
-          </w:tcPr>
-          <w:p>
-            <w:pPr>
-              <w:spacing w:after="20" w:before="20"/>
-              <w:ind w:firstLine="0" w:firstLineChars="0"/>
-            </w:pPr>
-            <w:r>
-              <w:rPr>
-                <w:b w:val="0"/>
-              </w:rPr>
-              <w:t>原文下一 token 预测；无聊天模板</w:t>
-            </w:r>
-          </w:p>
-        </w:tc>
-      </w:tr>
-    </w:tbl>
     <w:p>
       <w:pPr/>
       <w:r>
-        <w:t>本版本包含评测来源教材，属于定向学习实验。评测题目和答案文件本身不进入该语料；相关基准成绩不能作为独立泛化证明。</w:t>
+        <w:t>这条数据是一段港口与水运知识正文，包含来源提示和章节标题，没有问题、标准答案或对话角色。CPT 直接学习这段连续文本。</w:t>
+      </w:r>
+    </w:p>
+    <w:p>
+      <w:pPr/>
+      <w:r>
+        <w:t>样本来源：CPT_resources/llin-knowledge-complete-20260911/release/train.jsonl，第 1 行。正式训练使用对应 Parquet 的 text 字段，每条追加一次 EOS，最大长度 4,096，不套用聊天模板。</w:t>
+      </w:r>
+    </w:p>
+    <w:p>
+      <w:pPr/>
+      <w:r>
+        <w:t>完整语料共 4,912 条，其中教材正文 4,707 条、补充知识 205 条。该版本包含评测来源教材，属于定向学习实验，相关成绩不代表独立泛化。</w:t>
       </w:r>
     </w:p>
     <w:p>
       <w:pPr>
         <w:pStyle w:val="Heading1"/>
+        <w:pageBreakBefore/>
       </w:pPr>
       <w:r>
         <w:t>三 CPT 脚本运行指令</w:t>

</xml_diff>